<commit_message>
Ajustado CFA y actividad
</commit_message>
<xml_diff>
--- a/fuentes/63110194_CF02_DU.docx
+++ b/fuentes/63110194_CF02_DU.docx
@@ -617,7 +617,7 @@
           <w:r>
             <w:fldChar w:fldCharType="separate"/>
           </w:r>
-          <w:hyperlink w:anchor="_Toc228972074" w:history="1">
+          <w:hyperlink w:anchor="_Toc234317869" w:history="1">
             <w:r>
               <w:rPr>
                 <w:rStyle w:val="Hipervnculo"/>
@@ -644,7 +644,7 @@
                 <w:noProof/>
                 <w:webHidden/>
               </w:rPr>
-              <w:instrText xml:space="preserve"> PAGEREF _Toc228972074 \h </w:instrText>
+              <w:instrText xml:space="preserve"> PAGEREF _Toc234317869 \h </w:instrText>
             </w:r>
             <w:r>
               <w:rPr>
@@ -690,7 +690,7 @@
               <w:lang w:eastAsia="es-CO"/>
             </w:rPr>
           </w:pPr>
-          <w:hyperlink w:anchor="_Toc228972075" w:history="1">
+          <w:hyperlink w:anchor="_Toc234317870" w:history="1">
             <w:r>
               <w:rPr>
                 <w:rStyle w:val="Hipervnculo"/>
@@ -750,7 +750,7 @@
                 <w:noProof/>
                 <w:webHidden/>
               </w:rPr>
-              <w:instrText xml:space="preserve"> PAGEREF _Toc228972075 \h </w:instrText>
+              <w:instrText xml:space="preserve"> PAGEREF _Toc234317870 \h </w:instrText>
             </w:r>
             <w:r>
               <w:rPr>
@@ -792,7 +792,7 @@
               <w:lang w:eastAsia="es-CO"/>
             </w:rPr>
           </w:pPr>
-          <w:hyperlink w:anchor="_Toc228972076" w:history="1">
+          <w:hyperlink w:anchor="_Toc234317871" w:history="1">
             <w:r>
               <w:rPr>
                 <w:rStyle w:val="Hipervnculo"/>
@@ -836,7 +836,7 @@
                 <w:noProof/>
                 <w:webHidden/>
               </w:rPr>
-              <w:instrText xml:space="preserve"> PAGEREF _Toc228972076 \h </w:instrText>
+              <w:instrText xml:space="preserve"> PAGEREF _Toc234317871 \h </w:instrText>
             </w:r>
             <w:r>
               <w:rPr>
@@ -878,7 +878,7 @@
               <w:lang w:eastAsia="es-CO"/>
             </w:rPr>
           </w:pPr>
-          <w:hyperlink w:anchor="_Toc228972077" w:history="1">
+          <w:hyperlink w:anchor="_Toc234317872" w:history="1">
             <w:r>
               <w:rPr>
                 <w:rStyle w:val="Hipervnculo"/>
@@ -922,7 +922,7 @@
                 <w:noProof/>
                 <w:webHidden/>
               </w:rPr>
-              <w:instrText xml:space="preserve"> PAGEREF _Toc228972077 \h </w:instrText>
+              <w:instrText xml:space="preserve"> PAGEREF _Toc234317872 \h </w:instrText>
             </w:r>
             <w:r>
               <w:rPr>
@@ -968,7 +968,7 @@
               <w:lang w:eastAsia="es-CO"/>
             </w:rPr>
           </w:pPr>
-          <w:hyperlink w:anchor="_Toc228972078" w:history="1">
+          <w:hyperlink w:anchor="_Toc234317873" w:history="1">
             <w:r>
               <w:rPr>
                 <w:rStyle w:val="Hipervnculo"/>
@@ -1012,7 +1012,7 @@
                 <w:noProof/>
                 <w:webHidden/>
               </w:rPr>
-              <w:instrText xml:space="preserve"> PAGEREF _Toc228972078 \h </w:instrText>
+              <w:instrText xml:space="preserve"> PAGEREF _Toc234317873 \h </w:instrText>
             </w:r>
             <w:r>
               <w:rPr>
@@ -1032,7 +1032,7 @@
                 <w:noProof/>
                 <w:webHidden/>
               </w:rPr>
-              <w:t>10</w:t>
+              <w:t>9</w:t>
             </w:r>
             <w:r>
               <w:rPr>
@@ -1054,7 +1054,7 @@
               <w:lang w:eastAsia="es-CO"/>
             </w:rPr>
           </w:pPr>
-          <w:hyperlink w:anchor="_Toc228972079" w:history="1">
+          <w:hyperlink w:anchor="_Toc234317874" w:history="1">
             <w:r>
               <w:rPr>
                 <w:rStyle w:val="Hipervnculo"/>
@@ -1098,7 +1098,7 @@
                 <w:noProof/>
                 <w:webHidden/>
               </w:rPr>
-              <w:instrText xml:space="preserve"> PAGEREF _Toc228972079 \h </w:instrText>
+              <w:instrText xml:space="preserve"> PAGEREF _Toc234317874 \h </w:instrText>
             </w:r>
             <w:r>
               <w:rPr>
@@ -1118,7 +1118,7 @@
                 <w:noProof/>
                 <w:webHidden/>
               </w:rPr>
-              <w:t>10</w:t>
+              <w:t>9</w:t>
             </w:r>
             <w:r>
               <w:rPr>
@@ -1140,7 +1140,7 @@
               <w:lang w:eastAsia="es-CO"/>
             </w:rPr>
           </w:pPr>
-          <w:hyperlink w:anchor="_Toc228972080" w:history="1">
+          <w:hyperlink w:anchor="_Toc234317875" w:history="1">
             <w:r>
               <w:rPr>
                 <w:rStyle w:val="Hipervnculo"/>
@@ -1184,7 +1184,7 @@
                 <w:noProof/>
                 <w:webHidden/>
               </w:rPr>
-              <w:instrText xml:space="preserve"> PAGEREF _Toc228972080 \h </w:instrText>
+              <w:instrText xml:space="preserve"> PAGEREF _Toc234317875 \h </w:instrText>
             </w:r>
             <w:r>
               <w:rPr>
@@ -1204,7 +1204,7 @@
                 <w:noProof/>
                 <w:webHidden/>
               </w:rPr>
-              <w:t>10</w:t>
+              <w:t>9</w:t>
             </w:r>
             <w:r>
               <w:rPr>
@@ -1226,7 +1226,7 @@
               <w:lang w:eastAsia="es-CO"/>
             </w:rPr>
           </w:pPr>
-          <w:hyperlink w:anchor="_Toc228972081" w:history="1">
+          <w:hyperlink w:anchor="_Toc234317876" w:history="1">
             <w:r>
               <w:rPr>
                 <w:rStyle w:val="Hipervnculo"/>
@@ -1270,7 +1270,7 @@
                 <w:noProof/>
                 <w:webHidden/>
               </w:rPr>
-              <w:instrText xml:space="preserve"> PAGEREF _Toc228972081 \h </w:instrText>
+              <w:instrText xml:space="preserve"> PAGEREF _Toc234317876 \h </w:instrText>
             </w:r>
             <w:r>
               <w:rPr>
@@ -1290,7 +1290,7 @@
                 <w:noProof/>
                 <w:webHidden/>
               </w:rPr>
-              <w:t>13</w:t>
+              <w:t>12</w:t>
             </w:r>
             <w:r>
               <w:rPr>
@@ -1316,7 +1316,7 @@
               <w:lang w:eastAsia="es-CO"/>
             </w:rPr>
           </w:pPr>
-          <w:hyperlink w:anchor="_Toc228972082" w:history="1">
+          <w:hyperlink w:anchor="_Toc234317877" w:history="1">
             <w:r>
               <w:rPr>
                 <w:rStyle w:val="Hipervnculo"/>
@@ -1360,7 +1360,7 @@
                 <w:noProof/>
                 <w:webHidden/>
               </w:rPr>
-              <w:instrText xml:space="preserve"> PAGEREF _Toc228972082 \h </w:instrText>
+              <w:instrText xml:space="preserve"> PAGEREF _Toc234317877 \h </w:instrText>
             </w:r>
             <w:r>
               <w:rPr>
@@ -1380,7 +1380,7 @@
                 <w:noProof/>
                 <w:webHidden/>
               </w:rPr>
-              <w:t>19</w:t>
+              <w:t>17</w:t>
             </w:r>
             <w:r>
               <w:rPr>
@@ -1402,7 +1402,7 @@
               <w:lang w:eastAsia="es-CO"/>
             </w:rPr>
           </w:pPr>
-          <w:hyperlink w:anchor="_Toc228972083" w:history="1">
+          <w:hyperlink w:anchor="_Toc234317878" w:history="1">
             <w:r>
               <w:rPr>
                 <w:rStyle w:val="Hipervnculo"/>
@@ -1446,7 +1446,7 @@
                 <w:noProof/>
                 <w:webHidden/>
               </w:rPr>
-              <w:instrText xml:space="preserve"> PAGEREF _Toc228972083 \h </w:instrText>
+              <w:instrText xml:space="preserve"> PAGEREF _Toc234317878 \h </w:instrText>
             </w:r>
             <w:r>
               <w:rPr>
@@ -1466,7 +1466,7 @@
                 <w:noProof/>
                 <w:webHidden/>
               </w:rPr>
-              <w:t>19</w:t>
+              <w:t>17</w:t>
             </w:r>
             <w:r>
               <w:rPr>
@@ -1488,7 +1488,7 @@
               <w:lang w:eastAsia="es-CO"/>
             </w:rPr>
           </w:pPr>
-          <w:hyperlink w:anchor="_Toc228972084" w:history="1">
+          <w:hyperlink w:anchor="_Toc234317879" w:history="1">
             <w:r>
               <w:rPr>
                 <w:rStyle w:val="Hipervnculo"/>
@@ -1532,7 +1532,7 @@
                 <w:noProof/>
                 <w:webHidden/>
               </w:rPr>
-              <w:instrText xml:space="preserve"> PAGEREF _Toc228972084 \h </w:instrText>
+              <w:instrText xml:space="preserve"> PAGEREF _Toc234317879 \h </w:instrText>
             </w:r>
             <w:r>
               <w:rPr>
@@ -1552,7 +1552,7 @@
                 <w:noProof/>
                 <w:webHidden/>
               </w:rPr>
-              <w:t>19</w:t>
+              <w:t>17</w:t>
             </w:r>
             <w:r>
               <w:rPr>
@@ -1574,7 +1574,7 @@
               <w:lang w:eastAsia="es-CO"/>
             </w:rPr>
           </w:pPr>
-          <w:hyperlink w:anchor="_Toc228972085" w:history="1">
+          <w:hyperlink w:anchor="_Toc234317880" w:history="1">
             <w:r>
               <w:rPr>
                 <w:rStyle w:val="Hipervnculo"/>
@@ -1618,7 +1618,7 @@
                 <w:noProof/>
                 <w:webHidden/>
               </w:rPr>
-              <w:instrText xml:space="preserve"> PAGEREF _Toc228972085 \h </w:instrText>
+              <w:instrText xml:space="preserve"> PAGEREF _Toc234317880 \h </w:instrText>
             </w:r>
             <w:r>
               <w:rPr>
@@ -1638,7 +1638,7 @@
                 <w:noProof/>
                 <w:webHidden/>
               </w:rPr>
-              <w:t>22</w:t>
+              <w:t>20</w:t>
             </w:r>
             <w:r>
               <w:rPr>
@@ -1660,7 +1660,7 @@
               <w:lang w:eastAsia="es-CO"/>
             </w:rPr>
           </w:pPr>
-          <w:hyperlink w:anchor="_Toc228972086" w:history="1">
+          <w:hyperlink w:anchor="_Toc234317881" w:history="1">
             <w:r>
               <w:rPr>
                 <w:rStyle w:val="Hipervnculo"/>
@@ -1704,7 +1704,7 @@
                 <w:noProof/>
                 <w:webHidden/>
               </w:rPr>
-              <w:instrText xml:space="preserve"> PAGEREF _Toc228972086 \h </w:instrText>
+              <w:instrText xml:space="preserve"> PAGEREF _Toc234317881 \h </w:instrText>
             </w:r>
             <w:r>
               <w:rPr>
@@ -1724,7 +1724,7 @@
                 <w:noProof/>
                 <w:webHidden/>
               </w:rPr>
-              <w:t>22</w:t>
+              <w:t>20</w:t>
             </w:r>
             <w:r>
               <w:rPr>
@@ -1746,7 +1746,7 @@
               <w:lang w:eastAsia="es-CO"/>
             </w:rPr>
           </w:pPr>
-          <w:hyperlink w:anchor="_Toc228972087" w:history="1">
+          <w:hyperlink w:anchor="_Toc234317882" w:history="1">
             <w:r>
               <w:rPr>
                 <w:rStyle w:val="Hipervnculo"/>
@@ -1769,7 +1769,7 @@
                 <w:rStyle w:val="Hipervnculo"/>
                 <w:noProof/>
               </w:rPr>
-              <w:t>Calculo</w:t>
+              <w:t>Cálculo</w:t>
             </w:r>
             <w:r>
               <w:rPr>
@@ -1790,7 +1790,7 @@
                 <w:noProof/>
                 <w:webHidden/>
               </w:rPr>
-              <w:instrText xml:space="preserve"> PAGEREF _Toc228972087 \h </w:instrText>
+              <w:instrText xml:space="preserve"> PAGEREF _Toc234317882 \h </w:instrText>
             </w:r>
             <w:r>
               <w:rPr>
@@ -1810,7 +1810,7 @@
                 <w:noProof/>
                 <w:webHidden/>
               </w:rPr>
-              <w:t>22</w:t>
+              <w:t>21</w:t>
             </w:r>
             <w:r>
               <w:rPr>
@@ -1836,7 +1836,7 @@
               <w:lang w:eastAsia="es-CO"/>
             </w:rPr>
           </w:pPr>
-          <w:hyperlink w:anchor="_Toc228972088" w:history="1">
+          <w:hyperlink w:anchor="_Toc234317883" w:history="1">
             <w:r>
               <w:rPr>
                 <w:rStyle w:val="Hipervnculo"/>
@@ -1896,7 +1896,7 @@
                 <w:noProof/>
                 <w:webHidden/>
               </w:rPr>
-              <w:instrText xml:space="preserve"> PAGEREF _Toc228972088 \h </w:instrText>
+              <w:instrText xml:space="preserve"> PAGEREF _Toc234317883 \h </w:instrText>
             </w:r>
             <w:r>
               <w:rPr>
@@ -1916,7 +1916,7 @@
                 <w:noProof/>
                 <w:webHidden/>
               </w:rPr>
-              <w:t>26</w:t>
+              <w:t>24</w:t>
             </w:r>
             <w:r>
               <w:rPr>
@@ -1938,7 +1938,7 @@
               <w:lang w:eastAsia="es-CO"/>
             </w:rPr>
           </w:pPr>
-          <w:hyperlink w:anchor="_Toc228972089" w:history="1">
+          <w:hyperlink w:anchor="_Toc234317884" w:history="1">
             <w:r>
               <w:rPr>
                 <w:rStyle w:val="Hipervnculo"/>
@@ -1982,7 +1982,7 @@
                 <w:noProof/>
                 <w:webHidden/>
               </w:rPr>
-              <w:instrText xml:space="preserve"> PAGEREF _Toc228972089 \h </w:instrText>
+              <w:instrText xml:space="preserve"> PAGEREF _Toc234317884 \h </w:instrText>
             </w:r>
             <w:r>
               <w:rPr>
@@ -2002,7 +2002,7 @@
                 <w:noProof/>
                 <w:webHidden/>
               </w:rPr>
-              <w:t>26</w:t>
+              <w:t>24</w:t>
             </w:r>
             <w:r>
               <w:rPr>
@@ -2024,7 +2024,7 @@
               <w:lang w:eastAsia="es-CO"/>
             </w:rPr>
           </w:pPr>
-          <w:hyperlink w:anchor="_Toc228972090" w:history="1">
+          <w:hyperlink w:anchor="_Toc234317885" w:history="1">
             <w:r>
               <w:rPr>
                 <w:rStyle w:val="Hipervnculo"/>
@@ -2068,7 +2068,7 @@
                 <w:noProof/>
                 <w:webHidden/>
               </w:rPr>
-              <w:instrText xml:space="preserve"> PAGEREF _Toc228972090 \h </w:instrText>
+              <w:instrText xml:space="preserve"> PAGEREF _Toc234317885 \h </w:instrText>
             </w:r>
             <w:r>
               <w:rPr>
@@ -2088,7 +2088,7 @@
                 <w:noProof/>
                 <w:webHidden/>
               </w:rPr>
-              <w:t>29</w:t>
+              <w:t>27</w:t>
             </w:r>
             <w:r>
               <w:rPr>
@@ -2110,7 +2110,7 @@
               <w:lang w:eastAsia="es-CO"/>
             </w:rPr>
           </w:pPr>
-          <w:hyperlink w:anchor="_Toc228972091" w:history="1">
+          <w:hyperlink w:anchor="_Toc234317886" w:history="1">
             <w:r>
               <w:rPr>
                 <w:rStyle w:val="Hipervnculo"/>
@@ -2154,7 +2154,7 @@
                 <w:noProof/>
                 <w:webHidden/>
               </w:rPr>
-              <w:instrText xml:space="preserve"> PAGEREF _Toc228972091 \h </w:instrText>
+              <w:instrText xml:space="preserve"> PAGEREF _Toc234317886 \h </w:instrText>
             </w:r>
             <w:r>
               <w:rPr>
@@ -2174,7 +2174,7 @@
                 <w:noProof/>
                 <w:webHidden/>
               </w:rPr>
-              <w:t>30</w:t>
+              <w:t>28</w:t>
             </w:r>
             <w:r>
               <w:rPr>
@@ -2200,7 +2200,7 @@
               <w:lang w:eastAsia="es-CO"/>
             </w:rPr>
           </w:pPr>
-          <w:hyperlink w:anchor="_Toc228972092" w:history="1">
+          <w:hyperlink w:anchor="_Toc234317887" w:history="1">
             <w:r>
               <w:rPr>
                 <w:rStyle w:val="Hipervnculo"/>
@@ -2244,7 +2244,7 @@
                 <w:noProof/>
                 <w:webHidden/>
               </w:rPr>
-              <w:instrText xml:space="preserve"> PAGEREF _Toc228972092 \h </w:instrText>
+              <w:instrText xml:space="preserve"> PAGEREF _Toc234317887 \h </w:instrText>
             </w:r>
             <w:r>
               <w:rPr>
@@ -2264,7 +2264,7 @@
                 <w:noProof/>
                 <w:webHidden/>
               </w:rPr>
-              <w:t>33</w:t>
+              <w:t>31</w:t>
             </w:r>
             <w:r>
               <w:rPr>
@@ -2286,7 +2286,7 @@
               <w:lang w:eastAsia="es-CO"/>
             </w:rPr>
           </w:pPr>
-          <w:hyperlink w:anchor="_Toc228972093" w:history="1">
+          <w:hyperlink w:anchor="_Toc234317888" w:history="1">
             <w:r>
               <w:rPr>
                 <w:rStyle w:val="Hipervnculo"/>
@@ -2330,7 +2330,7 @@
                 <w:noProof/>
                 <w:webHidden/>
               </w:rPr>
-              <w:instrText xml:space="preserve"> PAGEREF _Toc228972093 \h </w:instrText>
+              <w:instrText xml:space="preserve"> PAGEREF _Toc234317888 \h </w:instrText>
             </w:r>
             <w:r>
               <w:rPr>
@@ -2350,7 +2350,7 @@
                 <w:noProof/>
                 <w:webHidden/>
               </w:rPr>
-              <w:t>33</w:t>
+              <w:t>31</w:t>
             </w:r>
             <w:r>
               <w:rPr>
@@ -2372,7 +2372,7 @@
               <w:lang w:eastAsia="es-CO"/>
             </w:rPr>
           </w:pPr>
-          <w:hyperlink w:anchor="_Toc228972094" w:history="1">
+          <w:hyperlink w:anchor="_Toc234317889" w:history="1">
             <w:r>
               <w:rPr>
                 <w:rStyle w:val="Hipervnculo"/>
@@ -2416,7 +2416,7 @@
                 <w:noProof/>
                 <w:webHidden/>
               </w:rPr>
-              <w:instrText xml:space="preserve"> PAGEREF _Toc228972094 \h </w:instrText>
+              <w:instrText xml:space="preserve"> PAGEREF _Toc234317889 \h </w:instrText>
             </w:r>
             <w:r>
               <w:rPr>
@@ -2436,7 +2436,7 @@
                 <w:noProof/>
                 <w:webHidden/>
               </w:rPr>
-              <w:t>35</w:t>
+              <w:t>32</w:t>
             </w:r>
             <w:r>
               <w:rPr>
@@ -2461,7 +2461,7 @@
               <w:lang w:eastAsia="es-CO"/>
             </w:rPr>
           </w:pPr>
-          <w:hyperlink w:anchor="_Toc228972095" w:history="1">
+          <w:hyperlink w:anchor="_Toc234317890" w:history="1">
             <w:r>
               <w:rPr>
                 <w:rStyle w:val="Hipervnculo"/>
@@ -2488,7 +2488,7 @@
                 <w:noProof/>
                 <w:webHidden/>
               </w:rPr>
-              <w:instrText xml:space="preserve"> PAGEREF _Toc228972095 \h </w:instrText>
+              <w:instrText xml:space="preserve"> PAGEREF _Toc234317890 \h </w:instrText>
             </w:r>
             <w:r>
               <w:rPr>
@@ -2508,7 +2508,7 @@
                 <w:noProof/>
                 <w:webHidden/>
               </w:rPr>
-              <w:t>40</w:t>
+              <w:t>37</w:t>
             </w:r>
             <w:r>
               <w:rPr>
@@ -2533,7 +2533,7 @@
               <w:lang w:eastAsia="es-CO"/>
             </w:rPr>
           </w:pPr>
-          <w:hyperlink w:anchor="_Toc228972096" w:history="1">
+          <w:hyperlink w:anchor="_Toc234317891" w:history="1">
             <w:r>
               <w:rPr>
                 <w:rStyle w:val="Hipervnculo"/>
@@ -2560,7 +2560,7 @@
                 <w:noProof/>
                 <w:webHidden/>
               </w:rPr>
-              <w:instrText xml:space="preserve"> PAGEREF _Toc228972096 \h </w:instrText>
+              <w:instrText xml:space="preserve"> PAGEREF _Toc234317891 \h </w:instrText>
             </w:r>
             <w:r>
               <w:rPr>
@@ -2580,7 +2580,7 @@
                 <w:noProof/>
                 <w:webHidden/>
               </w:rPr>
-              <w:t>41</w:t>
+              <w:t>38</w:t>
             </w:r>
             <w:r>
               <w:rPr>
@@ -2605,7 +2605,7 @@
               <w:lang w:eastAsia="es-CO"/>
             </w:rPr>
           </w:pPr>
-          <w:hyperlink w:anchor="_Toc228972097" w:history="1">
+          <w:hyperlink w:anchor="_Toc234317892" w:history="1">
             <w:r>
               <w:rPr>
                 <w:rStyle w:val="Hipervnculo"/>
@@ -2632,7 +2632,7 @@
                 <w:noProof/>
                 <w:webHidden/>
               </w:rPr>
-              <w:instrText xml:space="preserve"> PAGEREF _Toc228972097 \h </w:instrText>
+              <w:instrText xml:space="preserve"> PAGEREF _Toc234317892 \h </w:instrText>
             </w:r>
             <w:r>
               <w:rPr>
@@ -2652,7 +2652,7 @@
                 <w:noProof/>
                 <w:webHidden/>
               </w:rPr>
-              <w:t>44</w:t>
+              <w:t>41</w:t>
             </w:r>
             <w:r>
               <w:rPr>
@@ -2677,7 +2677,7 @@
               <w:lang w:eastAsia="es-CO"/>
             </w:rPr>
           </w:pPr>
-          <w:hyperlink w:anchor="_Toc228972098" w:history="1">
+          <w:hyperlink w:anchor="_Toc234317893" w:history="1">
             <w:r>
               <w:rPr>
                 <w:rStyle w:val="Hipervnculo"/>
@@ -2704,7 +2704,7 @@
                 <w:noProof/>
                 <w:webHidden/>
               </w:rPr>
-              <w:instrText xml:space="preserve"> PAGEREF _Toc228972098 \h </w:instrText>
+              <w:instrText xml:space="preserve"> PAGEREF _Toc234317893 \h </w:instrText>
             </w:r>
             <w:r>
               <w:rPr>
@@ -2724,7 +2724,7 @@
                 <w:noProof/>
                 <w:webHidden/>
               </w:rPr>
-              <w:t>46</w:t>
+              <w:t>43</w:t>
             </w:r>
             <w:r>
               <w:rPr>
@@ -2769,7 +2769,7 @@
       <w:pPr>
         <w:pStyle w:val="Titulosgenerales"/>
       </w:pPr>
-      <w:bookmarkStart w:id="0" w:name="_Toc228972074"/>
+      <w:bookmarkStart w:id="0" w:name="_Toc234317869"/>
       <w:r>
         <w:lastRenderedPageBreak/>
         <w:t>Introducción</w:t>
@@ -2831,7 +2831,7 @@
       <w:pPr>
         <w:pStyle w:val="Ttulo1"/>
       </w:pPr>
-      <w:bookmarkStart w:id="1" w:name="_Toc228972075"/>
+      <w:bookmarkStart w:id="1" w:name="_Toc234317870"/>
       <w:r>
         <w:lastRenderedPageBreak/>
         <w:t xml:space="preserve">Web </w:t>
@@ -2878,7 +2878,7 @@
       <w:pPr>
         <w:pStyle w:val="Ttulo2"/>
       </w:pPr>
-      <w:bookmarkStart w:id="2" w:name="_Toc228972076"/>
+      <w:bookmarkStart w:id="2" w:name="_Toc234317871"/>
       <w:r>
         <w:t>Concepto</w:t>
       </w:r>
@@ -2955,7 +2955,7 @@
       <w:pPr>
         <w:pStyle w:val="Ttulo2"/>
       </w:pPr>
-      <w:bookmarkStart w:id="3" w:name="_Toc228972077"/>
+      <w:bookmarkStart w:id="3" w:name="_Toc234317872"/>
       <w:r>
         <w:lastRenderedPageBreak/>
         <w:t>Metodología</w:t>
@@ -4207,7 +4207,7 @@
       <w:pPr>
         <w:pStyle w:val="Ttulo1"/>
       </w:pPr>
-      <w:bookmarkStart w:id="4" w:name="_Toc228972078"/>
+      <w:bookmarkStart w:id="4" w:name="_Toc234317873"/>
       <w:r>
         <w:lastRenderedPageBreak/>
         <w:t>M</w:t>
@@ -4246,7 +4246,7 @@
       <w:pPr>
         <w:pStyle w:val="Ttulo2"/>
       </w:pPr>
-      <w:bookmarkStart w:id="5" w:name="_Toc228972079"/>
+      <w:bookmarkStart w:id="5" w:name="_Toc234317874"/>
       <w:r>
         <w:t>Concepto</w:t>
       </w:r>
@@ -4374,7 +4374,7 @@
       <w:pPr>
         <w:pStyle w:val="Ttulo2"/>
       </w:pPr>
-      <w:bookmarkStart w:id="6" w:name="_Toc228972080"/>
+      <w:bookmarkStart w:id="6" w:name="_Toc234317875"/>
       <w:r>
         <w:t>Clases</w:t>
       </w:r>
@@ -5006,7 +5006,7 @@
       <w:pPr>
         <w:pStyle w:val="Ttulo2"/>
       </w:pPr>
-      <w:bookmarkStart w:id="7" w:name="_Toc228972081"/>
+      <w:bookmarkStart w:id="7" w:name="_Toc234317876"/>
       <w:r>
         <w:lastRenderedPageBreak/>
         <w:t>Aplicabilidad</w:t>
@@ -6249,7 +6249,7 @@
       <w:pPr>
         <w:pStyle w:val="Ttulo1"/>
       </w:pPr>
-      <w:bookmarkStart w:id="8" w:name="_Toc228972082"/>
+      <w:bookmarkStart w:id="8" w:name="_Toc234317877"/>
       <w:r>
         <w:lastRenderedPageBreak/>
         <w:t>Indicador clave de rendimiento</w:t>
@@ -6286,7 +6286,7 @@
       <w:pPr>
         <w:pStyle w:val="Ttulo2"/>
       </w:pPr>
-      <w:bookmarkStart w:id="9" w:name="_Toc228972083"/>
+      <w:bookmarkStart w:id="9" w:name="_Toc234317878"/>
       <w:r>
         <w:t>Concepto</w:t>
       </w:r>
@@ -6337,7 +6337,7 @@
       <w:pPr>
         <w:pStyle w:val="Ttulo2"/>
       </w:pPr>
-      <w:bookmarkStart w:id="10" w:name="_Toc228972084"/>
+      <w:bookmarkStart w:id="10" w:name="_Toc234317879"/>
       <w:r>
         <w:t>Estructura</w:t>
       </w:r>
@@ -6917,7 +6917,7 @@
       <w:pPr>
         <w:pStyle w:val="Ttulo2"/>
       </w:pPr>
-      <w:bookmarkStart w:id="11" w:name="_Toc228972085"/>
+      <w:bookmarkStart w:id="11" w:name="_Toc234317880"/>
       <w:r>
         <w:lastRenderedPageBreak/>
         <w:t>Interpretación</w:t>
@@ -7021,7 +7021,7 @@
       <w:pPr>
         <w:pStyle w:val="Ttulo2"/>
       </w:pPr>
-      <w:bookmarkStart w:id="12" w:name="_Toc228972086"/>
+      <w:bookmarkStart w:id="12" w:name="_Toc234317881"/>
       <w:r>
         <w:t>Aplicabilidad</w:t>
       </w:r>
@@ -7091,7 +7091,7 @@
       <w:pPr>
         <w:pStyle w:val="Ttulo2"/>
       </w:pPr>
-      <w:bookmarkStart w:id="13" w:name="_Toc228972087"/>
+      <w:bookmarkStart w:id="13" w:name="_Toc234317882"/>
       <w:r>
         <w:t>C</w:t>
       </w:r>
@@ -7599,7 +7599,7 @@
       <w:pPr>
         <w:pStyle w:val="Ttulo1"/>
       </w:pPr>
-      <w:bookmarkStart w:id="14" w:name="_Toc228972088"/>
+      <w:bookmarkStart w:id="14" w:name="_Toc234317883"/>
       <w:r>
         <w:lastRenderedPageBreak/>
         <w:t>KPI (</w:t>
@@ -7664,7 +7664,7 @@
       <w:pPr>
         <w:pStyle w:val="Ttulo2"/>
       </w:pPr>
-      <w:bookmarkStart w:id="15" w:name="_Toc228972089"/>
+      <w:bookmarkStart w:id="15" w:name="_Toc234317884"/>
       <w:r>
         <w:t>C</w:t>
       </w:r>
@@ -8104,7 +8104,7 @@
       <w:pPr>
         <w:pStyle w:val="Ttulo2"/>
       </w:pPr>
-      <w:bookmarkStart w:id="16" w:name="_Toc228972090"/>
+      <w:bookmarkStart w:id="16" w:name="_Toc234317885"/>
       <w:r>
         <w:t>Tipos</w:t>
       </w:r>
@@ -8493,7 +8493,7 @@
       <w:pPr>
         <w:pStyle w:val="Ttulo2"/>
       </w:pPr>
-      <w:bookmarkStart w:id="17" w:name="_Toc228972091"/>
+      <w:bookmarkStart w:id="17" w:name="_Toc234317886"/>
       <w:r>
         <w:t>Aplicabilidad</w:t>
       </w:r>
@@ -8876,7 +8876,7 @@
       <w:pPr>
         <w:pStyle w:val="Ttulo1"/>
       </w:pPr>
-      <w:bookmarkStart w:id="18" w:name="_Toc228972092"/>
+      <w:bookmarkStart w:id="18" w:name="_Toc234317887"/>
       <w:r>
         <w:lastRenderedPageBreak/>
         <w:t>P</w:t>
@@ -8942,7 +8942,7 @@
       <w:pPr>
         <w:pStyle w:val="Ttulo2"/>
       </w:pPr>
-      <w:bookmarkStart w:id="19" w:name="_Toc228972093"/>
+      <w:bookmarkStart w:id="19" w:name="_Toc234317888"/>
       <w:r>
         <w:t>C</w:t>
       </w:r>
@@ -9337,7 +9337,7 @@
       <w:pPr>
         <w:pStyle w:val="Ttulo2"/>
       </w:pPr>
-      <w:bookmarkStart w:id="20" w:name="_Toc228972094"/>
+      <w:bookmarkStart w:id="20" w:name="_Toc234317889"/>
       <w:r>
         <w:t>Aplicabilidad</w:t>
       </w:r>
@@ -10866,7 +10866,7 @@
       <w:pPr>
         <w:pStyle w:val="Titulosgenerales"/>
       </w:pPr>
-      <w:bookmarkStart w:id="21" w:name="_Toc228972095"/>
+      <w:bookmarkStart w:id="21" w:name="_Toc234317890"/>
       <w:r>
         <w:lastRenderedPageBreak/>
         <w:t>S</w:t>
@@ -10994,7 +10994,7 @@
       <w:pPr>
         <w:pStyle w:val="Titulosgenerales"/>
       </w:pPr>
-      <w:bookmarkStart w:id="22" w:name="_Toc228972096"/>
+      <w:bookmarkStart w:id="22" w:name="_Toc234317891"/>
       <w:r>
         <w:lastRenderedPageBreak/>
         <w:t>Glosario</w:t>
@@ -12095,7 +12095,7 @@
       <w:pPr>
         <w:pStyle w:val="Titulosgenerales"/>
       </w:pPr>
-      <w:bookmarkStart w:id="23" w:name="_Toc228972097"/>
+      <w:bookmarkStart w:id="23" w:name="_Toc234317892"/>
       <w:r>
         <w:lastRenderedPageBreak/>
         <w:t>Referencias bibliográficas</w:t>
@@ -12302,7 +12302,7 @@
       <w:pPr>
         <w:pStyle w:val="Titulosgenerales"/>
       </w:pPr>
-      <w:bookmarkStart w:id="24" w:name="_Toc228972098"/>
+      <w:bookmarkStart w:id="24" w:name="_Toc234317893"/>
       <w:r>
         <w:lastRenderedPageBreak/>
         <w:t>C</w:t>
@@ -19208,7 +19208,12 @@
 </file>
 
 <file path=customXml/item2.xml><?xml version="1.0" encoding="utf-8"?>
-<b:Sources xmlns:b="http://schemas.openxmlformats.org/officeDocument/2006/bibliography" xmlns="http://schemas.openxmlformats.org/officeDocument/2006/bibliography" SelectedStyle="\APASixthEditionOfficeOnline.xsl" StyleName="APA" Version="6"/>
+<?mso-contentType ?>
+<FormTemplates xmlns="http://schemas.microsoft.com/sharepoint/v3/contenttype/forms">
+  <Display>DocumentLibraryForm</Display>
+  <Edit>DocumentLibraryForm</Edit>
+  <New>DocumentLibraryForm</New>
+</FormTemplates>
 </file>
 
 <file path=customXml/item3.xml><?xml version="1.0" encoding="utf-8"?>
@@ -19447,12 +19452,7 @@
 </file>
 
 <file path=customXml/item4.xml><?xml version="1.0" encoding="utf-8"?>
-<?mso-contentType ?>
-<FormTemplates xmlns="http://schemas.microsoft.com/sharepoint/v3/contenttype/forms">
-  <Display>DocumentLibraryForm</Display>
-  <Edit>DocumentLibraryForm</Edit>
-  <New>DocumentLibraryForm</New>
-</FormTemplates>
+<b:Sources xmlns:b="http://schemas.openxmlformats.org/officeDocument/2006/bibliography" xmlns="http://schemas.openxmlformats.org/officeDocument/2006/bibliography" SelectedStyle="\APASixthEditionOfficeOnline.xsl" StyleName="APA" Version="6"/>
 </file>
 
 <file path=customXml/itemProps1.xml><?xml version="1.0" encoding="utf-8"?>
@@ -19467,21 +19467,21 @@
 </file>
 
 <file path=customXml/itemProps2.xml><?xml version="1.0" encoding="utf-8"?>
+<ds:datastoreItem xmlns:ds="http://schemas.openxmlformats.org/officeDocument/2006/customXml" ds:itemID="{81CBDEC1-3B00-44ED-AD36-0268077980BA}">
+  <ds:schemaRefs>
+    <ds:schemaRef ds:uri="http://schemas.microsoft.com/sharepoint/v3/contenttype/forms"/>
+  </ds:schemaRefs>
+</ds:datastoreItem>
+</file>
+
+<file path=customXml/itemProps3.xml><?xml version="1.0" encoding="utf-8"?>
+<ds:datastoreItem xmlns:ds="http://schemas.openxmlformats.org/officeDocument/2006/customXml" ds:itemID="{1F6CFACB-2E1C-4DBC-B417-BEE1ED5882EC}"/>
+</file>
+
+<file path=customXml/itemProps4.xml><?xml version="1.0" encoding="utf-8"?>
 <ds:datastoreItem xmlns:ds="http://schemas.openxmlformats.org/officeDocument/2006/customXml" ds:itemID="{E8AB44A3-7C62-4BD2-82ED-8ABC209970FA}">
   <ds:schemaRefs>
     <ds:schemaRef ds:uri="http://schemas.openxmlformats.org/officeDocument/2006/bibliography"/>
   </ds:schemaRefs>
 </ds:datastoreItem>
-</file>
-
-<file path=customXml/itemProps3.xml><?xml version="1.0" encoding="utf-8"?>
-<ds:datastoreItem xmlns:ds="http://schemas.openxmlformats.org/officeDocument/2006/customXml" ds:itemID="{FC7B137F-87B9-495B-9E81-D0C3146EAF18}"/>
-</file>
-
-<file path=customXml/itemProps4.xml><?xml version="1.0" encoding="utf-8"?>
-<ds:datastoreItem xmlns:ds="http://schemas.openxmlformats.org/officeDocument/2006/customXml" ds:itemID="{81CBDEC1-3B00-44ED-AD36-0268077980BA}">
-  <ds:schemaRefs>
-    <ds:schemaRef ds:uri="http://schemas.microsoft.com/sharepoint/v3/contenttype/forms"/>
-  </ds:schemaRefs>
-</ds:datastoreItem>
 </file>
</xml_diff>